<commit_message>
Change 7: Spring Community Impact Grants: opening date changed from February 1, 2027 to February 15, 2027.
Independent test branch created directly from BASELINE v1-original
(a5b0342). Contains this change only.

Co-Authored-By: Claude Opus 5.5 <noreply@anthropic.com>
Claude-Session: https://claude.ai/code/session_01CQxLpwe1Pu1FJJBAM5jt5M
</commit_message>
<xml_diff>
--- a/documents-src/guidelines/cpcf-2027-spring-community-impact-grant-guidelines.docx
+++ b/documents-src/guidelines/cpcf-2027-spring-community-impact-grant-guidelines.docx
@@ -31,7 +31,7 @@
           <w:color w:val="5F6B6E"/>
           <w:sz w:val="22"/>
         </w:rPr>
-        <w:t>Competitive general operating grant  ·  Opens February 1, 2027</w:t>
+        <w:t>Competitive general operating grant  ·  Opens February 15, 2027</w:t>
       </w:r>
     </w:p>
     <w:tbl>
@@ -720,7 +720,7 @@
               <w:rPr>
                 <w:sz w:val="19"/>
               </w:rPr>
-              <w:t>Monday, February 1, 2027</w:t>
+              <w:t>Monday, February 15, 2027</w:t>
             </w:r>
           </w:p>
         </w:tc>

</xml_diff>